<commit_message>
docs(thesis): regenerate slides, video and DOCX template with refreshed numbers
</commit_message>
<xml_diff>
--- a/thesis/thesis_template.docx
+++ b/thesis/thesis_template.docx
@@ -488,7 +488,7 @@
           <w:color w:val="000000"/>
           <w:sz w:val="24"/>
         </w:rPr>
-        <w:t>[English abstract 150–250 words: background, problem, objectives, methodology, key results — 35 screens, 20 ratios, Algerian tax engine, 1800 tests, 100% coverage.]</w:t>
+        <w:t>[English abstract 150–250 words: background, problem, objectives, methodology, key results — 42 screens, 20 ratios, Algerian tax engine, 2142 tests, 100% coverage.]</w:t>
       </w:r>
     </w:p>
     <w:p>
@@ -1980,7 +1980,7 @@
           <w:color w:val="000000"/>
           <w:sz w:val="24"/>
         </w:rPr>
-        <w:t>Appendix B — Screen Catalogue (35 screens)</w:t>
+        <w:t>Appendix B — Screen Catalogue (42 screens)</w:t>
       </w:r>
     </w:p>
     <w:p>

</xml_diff>